<commit_message>
changes on team declaration
</commit_message>
<xml_diff>
--- a/Documentation/Team_Declaration.docx
+++ b/Documentation/Team_Declaration.docx
@@ -455,604 +455,1028 @@
     </w:p>
     <w:p>
       <w:pPr>
-        <w:rPr>
-          <w:lang w:val="en-GB"/>
-        </w:rPr>
-      </w:pPr>
-      <w:r>
-        <w:rPr>
+        <w:jc w:val="both"/>
+        <w:rPr>
+          <w:rFonts w:asciiTheme="majorHAnsi" w:hAnsiTheme="majorHAnsi" w:cs="Times New Roman"/>
+          <w:sz w:val="22"/>
+          <w:szCs w:val="22"/>
+        </w:rPr>
+      </w:pPr>
+      <w:r>
+        <w:rPr>
+          <w:rFonts w:asciiTheme="majorHAnsi" w:hAnsiTheme="majorHAnsi" w:cs="Times New Roman"/>
+          <w:sz w:val="22"/>
+          <w:szCs w:val="22"/>
           <w:lang w:val="en-GB"/>
         </w:rPr>
         <w:lastRenderedPageBreak/>
-        <w:t>This project was a collaborative effort. The following roles and contributions are acknowledged:</w:t>
-      </w:r>
-    </w:p>
-    <w:p>
-      <w:pPr>
-        <w:pStyle w:val="Prrafodelista"/>
+        <w:t xml:space="preserve">This project was the result of a collaborative effort, with each team member contributing to different aspects of the research and development pipeline. </w:t>
+      </w:r>
+      <w:proofErr w:type="spellStart"/>
+      <w:r>
+        <w:rPr>
+          <w:rFonts w:asciiTheme="majorHAnsi" w:hAnsiTheme="majorHAnsi" w:cs="Times New Roman"/>
+          <w:sz w:val="22"/>
+          <w:szCs w:val="22"/>
+        </w:rPr>
+        <w:t>The</w:t>
+      </w:r>
+      <w:proofErr w:type="spellEnd"/>
+      <w:r>
+        <w:rPr>
+          <w:rFonts w:asciiTheme="majorHAnsi" w:hAnsiTheme="majorHAnsi" w:cs="Times New Roman"/>
+          <w:sz w:val="22"/>
+          <w:szCs w:val="22"/>
+        </w:rPr>
+        <w:t xml:space="preserve"> </w:t>
+      </w:r>
+      <w:proofErr w:type="spellStart"/>
+      <w:r>
+        <w:rPr>
+          <w:rFonts w:asciiTheme="majorHAnsi" w:hAnsiTheme="majorHAnsi" w:cs="Times New Roman"/>
+          <w:sz w:val="22"/>
+          <w:szCs w:val="22"/>
+        </w:rPr>
+        <w:t>main</w:t>
+      </w:r>
+      <w:proofErr w:type="spellEnd"/>
+      <w:r>
+        <w:rPr>
+          <w:rFonts w:asciiTheme="majorHAnsi" w:hAnsiTheme="majorHAnsi" w:cs="Times New Roman"/>
+          <w:sz w:val="22"/>
+          <w:szCs w:val="22"/>
+        </w:rPr>
+        <w:t xml:space="preserve"> roles and </w:t>
+      </w:r>
+      <w:proofErr w:type="spellStart"/>
+      <w:r>
+        <w:rPr>
+          <w:rFonts w:asciiTheme="majorHAnsi" w:hAnsiTheme="majorHAnsi" w:cs="Times New Roman"/>
+          <w:sz w:val="22"/>
+          <w:szCs w:val="22"/>
+        </w:rPr>
+        <w:t>contributions</w:t>
+      </w:r>
+      <w:proofErr w:type="spellEnd"/>
+      <w:r>
+        <w:rPr>
+          <w:rFonts w:asciiTheme="majorHAnsi" w:hAnsiTheme="majorHAnsi" w:cs="Times New Roman"/>
+          <w:sz w:val="22"/>
+          <w:szCs w:val="22"/>
+        </w:rPr>
+        <w:t xml:space="preserve"> are </w:t>
+      </w:r>
+      <w:proofErr w:type="spellStart"/>
+      <w:r>
+        <w:rPr>
+          <w:rFonts w:asciiTheme="majorHAnsi" w:hAnsiTheme="majorHAnsi" w:cs="Times New Roman"/>
+          <w:sz w:val="22"/>
+          <w:szCs w:val="22"/>
+        </w:rPr>
+        <w:t>outlined</w:t>
+      </w:r>
+      <w:proofErr w:type="spellEnd"/>
+      <w:r>
+        <w:rPr>
+          <w:rFonts w:asciiTheme="majorHAnsi" w:hAnsiTheme="majorHAnsi" w:cs="Times New Roman"/>
+          <w:sz w:val="22"/>
+          <w:szCs w:val="22"/>
+        </w:rPr>
+        <w:t xml:space="preserve"> as </w:t>
+      </w:r>
+      <w:proofErr w:type="spellStart"/>
+      <w:r>
+        <w:rPr>
+          <w:rFonts w:asciiTheme="majorHAnsi" w:hAnsiTheme="majorHAnsi" w:cs="Times New Roman"/>
+          <w:sz w:val="22"/>
+          <w:szCs w:val="22"/>
+        </w:rPr>
+        <w:t>follows</w:t>
+      </w:r>
+      <w:proofErr w:type="spellEnd"/>
+      <w:r>
+        <w:rPr>
+          <w:rFonts w:asciiTheme="majorHAnsi" w:hAnsiTheme="majorHAnsi" w:cs="Times New Roman"/>
+          <w:sz w:val="22"/>
+          <w:szCs w:val="22"/>
+        </w:rPr>
+        <w:t>:</w:t>
+      </w:r>
+    </w:p>
+    <w:p>
+      <w:pPr>
         <w:numPr>
           <w:ilvl w:val="0"/>
-          <w:numId w:val="2"/>
+          <w:numId w:val="4"/>
         </w:numPr>
-        <w:rPr>
-          <w:lang w:val="en-GB"/>
-        </w:rPr>
-      </w:pPr>
-      <w:r>
-        <w:rPr>
-          <w:b/>
-          <w:bCs/>
+        <w:jc w:val="both"/>
+        <w:rPr>
+          <w:rFonts w:asciiTheme="majorHAnsi" w:hAnsiTheme="majorHAnsi" w:cs="Times New Roman"/>
+          <w:sz w:val="22"/>
+          <w:szCs w:val="22"/>
+          <w:lang w:val="en-GB"/>
+        </w:rPr>
+      </w:pPr>
+      <w:r>
+        <w:rPr>
+          <w:rFonts w:asciiTheme="majorHAnsi" w:hAnsiTheme="majorHAnsi" w:cs="Times New Roman"/>
+          <w:b/>
+          <w:bCs/>
+          <w:sz w:val="22"/>
+          <w:szCs w:val="22"/>
           <w:lang w:val="en-GB"/>
         </w:rPr>
         <w:t>Concept and Design</w:t>
       </w:r>
       <w:r>
         <w:rPr>
-          <w:lang w:val="en-GB"/>
-        </w:rPr>
-        <w:t>:</w:t>
-      </w:r>
-      <w:r>
-        <w:rPr>
-          <w:lang w:val="en-GB"/>
-        </w:rPr>
-        <w:t xml:space="preserve"> Definition of the research scope and overall project design, including the integration of Named Entity Recognition (NER), Sentiment Analysis (SA), and Alert Generation. </w:t>
-      </w:r>
-    </w:p>
-    <w:p>
-      <w:pPr>
-        <w:pStyle w:val="Prrafodelista"/>
+          <w:rFonts w:asciiTheme="majorHAnsi" w:hAnsiTheme="majorHAnsi" w:cs="Times New Roman"/>
+          <w:sz w:val="22"/>
+          <w:szCs w:val="22"/>
+          <w:lang w:val="en-GB"/>
+        </w:rPr>
+        <w:t>: Defined the research objectives and overall architecture of the project, including the integration of Named Entity Recognition (NER), Sentiment Analysis (SA), and Alert Generation (AG) into a unified pipeline.</w:t>
+      </w:r>
+    </w:p>
+    <w:p>
+      <w:pPr>
         <w:numPr>
           <w:ilvl w:val="0"/>
-          <w:numId w:val="2"/>
+          <w:numId w:val="4"/>
         </w:numPr>
-        <w:rPr>
-          <w:lang w:val="en-GB"/>
-        </w:rPr>
-      </w:pPr>
-      <w:r>
-        <w:rPr>
-          <w:b/>
-          <w:bCs/>
-          <w:lang w:val="en-GB"/>
-        </w:rPr>
-        <w:t>Data Preparation and Preprocessing:</w:t>
-      </w:r>
-      <w:r>
-        <w:rPr>
-          <w:lang w:val="en-GB"/>
-        </w:rPr>
-        <w:t xml:space="preserve"> Collection and preprocessing of the </w:t>
-      </w:r>
-      <w:r>
-        <w:rPr>
-          <w:lang w:val="en-GB"/>
-        </w:rPr>
-        <w:t>(CoNLL-2003, Sentiment140, flickr30k</w:t>
-      </w:r>
-      <w:r>
-        <w:rPr>
-          <w:lang w:val="en-GB"/>
-        </w:rPr>
-        <w:t xml:space="preserve">, </w:t>
-      </w:r>
-      <w:r>
-        <w:rPr>
-          <w:lang w:val="en-GB"/>
-        </w:rPr>
-        <w:t xml:space="preserve">which involved cleaning inputs tokens, sentiment </w:t>
-      </w:r>
-      <w:r>
-        <w:rPr>
-          <w:lang w:val="en-GB"/>
-        </w:rPr>
-        <w:t>mapping, labelling and much more.</w:t>
-      </w:r>
-    </w:p>
-    <w:p>
-      <w:pPr>
-        <w:pStyle w:val="Prrafodelista"/>
+        <w:jc w:val="both"/>
+        <w:rPr>
+          <w:rFonts w:asciiTheme="majorHAnsi" w:hAnsiTheme="majorHAnsi" w:cs="Times New Roman"/>
+          <w:sz w:val="22"/>
+          <w:szCs w:val="22"/>
+          <w:lang w:val="en-GB"/>
+        </w:rPr>
+      </w:pPr>
+      <w:r>
+        <w:rPr>
+          <w:rFonts w:asciiTheme="majorHAnsi" w:hAnsiTheme="majorHAnsi" w:cs="Times New Roman"/>
+          <w:b/>
+          <w:bCs/>
+          <w:sz w:val="22"/>
+          <w:szCs w:val="22"/>
+          <w:lang w:val="en-GB"/>
+        </w:rPr>
+        <w:t>Data Preparation and Preprocessing</w:t>
+      </w:r>
+      <w:r>
+        <w:rPr>
+          <w:rFonts w:asciiTheme="majorHAnsi" w:hAnsiTheme="majorHAnsi" w:cs="Times New Roman"/>
+          <w:sz w:val="22"/>
+          <w:szCs w:val="22"/>
+          <w:lang w:val="en-GB"/>
+        </w:rPr>
+        <w:t xml:space="preserve">: Curated and processed datasets such as CoNLL-2003, Sentiment140, and Flickr30k. Tasks included token normalization, sentiment mapping, </w:t>
+      </w:r>
+      <w:proofErr w:type="spellStart"/>
+      <w:r>
+        <w:rPr>
+          <w:rFonts w:asciiTheme="majorHAnsi" w:hAnsiTheme="majorHAnsi" w:cs="Times New Roman"/>
+          <w:sz w:val="22"/>
+          <w:szCs w:val="22"/>
+          <w:lang w:val="en-GB"/>
+        </w:rPr>
+        <w:t>labeling</w:t>
+      </w:r>
+      <w:proofErr w:type="spellEnd"/>
+      <w:r>
+        <w:rPr>
+          <w:rFonts w:asciiTheme="majorHAnsi" w:hAnsiTheme="majorHAnsi" w:cs="Times New Roman"/>
+          <w:sz w:val="22"/>
+          <w:szCs w:val="22"/>
+          <w:lang w:val="en-GB"/>
+        </w:rPr>
+        <w:t>, and dataset alignment to support multimodal and multitask learning.</w:t>
+      </w:r>
+    </w:p>
+    <w:p>
+      <w:pPr>
         <w:numPr>
           <w:ilvl w:val="0"/>
-          <w:numId w:val="2"/>
+          <w:numId w:val="4"/>
         </w:numPr>
-        <w:rPr>
-          <w:lang w:val="en-GB"/>
-        </w:rPr>
-      </w:pPr>
-      <w:r>
-        <w:rPr>
-          <w:b/>
-          <w:bCs/>
-          <w:lang w:val="en-GB"/>
-        </w:rPr>
-        <w:t>Sentiment Analisis</w:t>
-      </w:r>
-      <w:r>
-        <w:rPr>
-          <w:lang w:val="en-GB"/>
-        </w:rPr>
-        <w:t>:</w:t>
-      </w:r>
-      <w:r>
-        <w:rPr>
-          <w:lang w:val="en-GB"/>
-        </w:rPr>
-        <w:t xml:space="preserve"> </w:t>
-      </w:r>
-      <w:r>
-        <w:rPr>
-          <w:lang w:val="en-GB"/>
-        </w:rPr>
-        <w:t>design, training, improvements</w:t>
-      </w:r>
-      <w:r>
-        <w:rPr>
-          <w:lang w:val="en-GB"/>
-        </w:rPr>
-        <w:t xml:space="preserve"> such as</w:t>
-      </w:r>
-      <w:r>
-        <w:rPr>
-          <w:lang w:val="en-GB"/>
-        </w:rPr>
-        <w:t xml:space="preserve"> multihead </w:t>
-      </w:r>
-      <w:r>
-        <w:rPr>
-          <w:lang w:val="en-GB"/>
-        </w:rPr>
-        <w:t>attention.</w:t>
-      </w:r>
-    </w:p>
-    <w:p>
-      <w:pPr>
-        <w:pStyle w:val="Prrafodelista"/>
+        <w:jc w:val="both"/>
+        <w:rPr>
+          <w:rFonts w:asciiTheme="majorHAnsi" w:hAnsiTheme="majorHAnsi" w:cs="Times New Roman"/>
+          <w:sz w:val="22"/>
+          <w:szCs w:val="22"/>
+          <w:lang w:val="en-GB"/>
+        </w:rPr>
+      </w:pPr>
+      <w:r>
+        <w:rPr>
+          <w:rFonts w:asciiTheme="majorHAnsi" w:hAnsiTheme="majorHAnsi" w:cs="Times New Roman"/>
+          <w:b/>
+          <w:bCs/>
+          <w:sz w:val="22"/>
+          <w:szCs w:val="22"/>
+          <w:lang w:val="en-GB"/>
+        </w:rPr>
+        <w:t>Sentiment Analysis</w:t>
+      </w:r>
+      <w:r>
+        <w:rPr>
+          <w:rFonts w:asciiTheme="majorHAnsi" w:hAnsiTheme="majorHAnsi" w:cs="Times New Roman"/>
+          <w:sz w:val="22"/>
+          <w:szCs w:val="22"/>
+          <w:lang w:val="en-GB"/>
+        </w:rPr>
+        <w:t>: Developed and trained the sentiment analysis model, incorporating improvements such as multi-head attention mechanisms and optimized training procedures to enhance performance.</w:t>
+      </w:r>
+    </w:p>
+    <w:p>
+      <w:pPr>
         <w:numPr>
           <w:ilvl w:val="0"/>
-          <w:numId w:val="2"/>
+          <w:numId w:val="4"/>
         </w:numPr>
-        <w:rPr>
-          <w:lang w:val="en-GB"/>
-        </w:rPr>
-      </w:pPr>
-      <w:r>
-        <w:rPr>
-          <w:b/>
-          <w:bCs/>
+        <w:jc w:val="both"/>
+        <w:rPr>
+          <w:rFonts w:asciiTheme="majorHAnsi" w:hAnsiTheme="majorHAnsi" w:cs="Times New Roman"/>
+          <w:sz w:val="22"/>
+          <w:szCs w:val="22"/>
+          <w:lang w:val="en-GB"/>
+        </w:rPr>
+      </w:pPr>
+      <w:r>
+        <w:rPr>
+          <w:rFonts w:asciiTheme="majorHAnsi" w:hAnsiTheme="majorHAnsi" w:cs="Times New Roman"/>
+          <w:b/>
+          <w:bCs/>
+          <w:sz w:val="22"/>
+          <w:szCs w:val="22"/>
           <w:lang w:val="en-GB"/>
         </w:rPr>
         <w:t>Named Entity Recognition</w:t>
       </w:r>
       <w:r>
         <w:rPr>
-          <w:lang w:val="en-GB"/>
-        </w:rPr>
-        <w:t>:</w:t>
-      </w:r>
-    </w:p>
-    <w:p>
-      <w:pPr>
-        <w:pStyle w:val="Prrafodelista"/>
+          <w:rFonts w:asciiTheme="majorHAnsi" w:hAnsiTheme="majorHAnsi" w:cs="Times New Roman"/>
+          <w:sz w:val="22"/>
+          <w:szCs w:val="22"/>
+          <w:lang w:val="en-GB"/>
+        </w:rPr>
+        <w:t>: Designed and implemented the NER model, focusing on improving entity classification accuracy through custom architecture modifications and extensive preprocessing.</w:t>
+      </w:r>
+    </w:p>
+    <w:p>
+      <w:pPr>
         <w:numPr>
           <w:ilvl w:val="0"/>
-          <w:numId w:val="2"/>
+          <w:numId w:val="4"/>
         </w:numPr>
-        <w:rPr>
-          <w:lang w:val="en-GB"/>
-        </w:rPr>
-      </w:pPr>
-      <w:r>
-        <w:rPr>
-          <w:b/>
-          <w:bCs/>
-          <w:lang w:val="en-GB"/>
-        </w:rPr>
-        <w:t>Model Experimentation</w:t>
-      </w:r>
-      <w:r>
-        <w:rPr>
-          <w:b/>
-          <w:bCs/>
-          <w:lang w:val="en-GB"/>
-        </w:rPr>
-        <w:t xml:space="preserve"> and Prompt Engineering for AG</w:t>
-      </w:r>
-      <w:r>
-        <w:rPr>
-          <w:lang w:val="en-GB"/>
-        </w:rPr>
-        <w:t xml:space="preserve">: </w:t>
-      </w:r>
-      <w:r>
-        <w:rPr>
-          <w:lang w:val="en-GB"/>
-        </w:rPr>
-        <w:t>Implementation and comparison of classical supervised fine-tuning approaches (e.g., T5-small) and prompt-based inference using LLaMA models. Design of prompting strategies using both instructional and role-based templates to effectively combine SA and NER information into generative inputs for language models.</w:t>
-      </w:r>
-    </w:p>
-    <w:p>
-      <w:pPr>
-        <w:pStyle w:val="Prrafodelista"/>
+        <w:jc w:val="both"/>
+        <w:rPr>
+          <w:rFonts w:asciiTheme="majorHAnsi" w:hAnsiTheme="majorHAnsi" w:cs="Times New Roman"/>
+          <w:sz w:val="22"/>
+          <w:szCs w:val="22"/>
+          <w:lang w:val="en-GB"/>
+        </w:rPr>
+      </w:pPr>
+      <w:r>
+        <w:rPr>
+          <w:rFonts w:asciiTheme="majorHAnsi" w:hAnsiTheme="majorHAnsi" w:cs="Times New Roman"/>
+          <w:b/>
+          <w:bCs/>
+          <w:sz w:val="22"/>
+          <w:szCs w:val="22"/>
+          <w:lang w:val="en-GB"/>
+        </w:rPr>
+        <w:t>Model Experimentation and Prompt Engineering for Alert Generation</w:t>
+      </w:r>
+      <w:r>
+        <w:rPr>
+          <w:rFonts w:asciiTheme="majorHAnsi" w:hAnsiTheme="majorHAnsi" w:cs="Times New Roman"/>
+          <w:sz w:val="22"/>
+          <w:szCs w:val="22"/>
+          <w:lang w:val="en-GB"/>
+        </w:rPr>
+        <w:t xml:space="preserve">: Explored both supervised fine-tuning (e.g., using T5-small) and prompt-based generation using </w:t>
+      </w:r>
+      <w:proofErr w:type="spellStart"/>
+      <w:r>
+        <w:rPr>
+          <w:rFonts w:asciiTheme="majorHAnsi" w:hAnsiTheme="majorHAnsi" w:cs="Times New Roman"/>
+          <w:sz w:val="22"/>
+          <w:szCs w:val="22"/>
+          <w:lang w:val="en-GB"/>
+        </w:rPr>
+        <w:t>LLaMA</w:t>
+      </w:r>
+      <w:proofErr w:type="spellEnd"/>
+      <w:r>
+        <w:rPr>
+          <w:rFonts w:asciiTheme="majorHAnsi" w:hAnsiTheme="majorHAnsi" w:cs="Times New Roman"/>
+          <w:sz w:val="22"/>
+          <w:szCs w:val="22"/>
+          <w:lang w:val="en-GB"/>
+        </w:rPr>
+        <w:t xml:space="preserve"> models. Developed prompt engineering techniques using instructional and role-based prompting to synthesize SA and NER outputs into coherent alert texts.</w:t>
+      </w:r>
+    </w:p>
+    <w:p>
+      <w:pPr>
         <w:numPr>
           <w:ilvl w:val="0"/>
-          <w:numId w:val="2"/>
+          <w:numId w:val="4"/>
         </w:numPr>
-        <w:rPr>
-          <w:lang w:val="en-GB"/>
-        </w:rPr>
-      </w:pPr>
-      <w:r>
-        <w:rPr>
-          <w:b/>
-          <w:bCs/>
+        <w:jc w:val="both"/>
+        <w:rPr>
+          <w:rFonts w:asciiTheme="majorHAnsi" w:hAnsiTheme="majorHAnsi" w:cs="Times New Roman"/>
+          <w:sz w:val="22"/>
+          <w:szCs w:val="22"/>
+          <w:lang w:val="en-GB"/>
+        </w:rPr>
+      </w:pPr>
+      <w:r>
+        <w:rPr>
+          <w:rFonts w:asciiTheme="majorHAnsi" w:hAnsiTheme="majorHAnsi" w:cs="Times New Roman"/>
+          <w:b/>
+          <w:bCs/>
+          <w:sz w:val="22"/>
+          <w:szCs w:val="22"/>
           <w:lang w:val="en-GB"/>
         </w:rPr>
         <w:t>Multimodal Integration</w:t>
       </w:r>
       <w:r>
         <w:rPr>
-          <w:lang w:val="en-GB"/>
-        </w:rPr>
-        <w:t xml:space="preserve">: </w:t>
-      </w:r>
-      <w:r>
-        <w:rPr>
-          <w:lang w:val="en-GB"/>
-        </w:rPr>
-        <w:t>Initial research and experimentation with image captioning models to extend the scope of alert generation to multimodal inputs</w:t>
-      </w:r>
-      <w:r>
-        <w:rPr>
-          <w:lang w:val="en-GB"/>
-        </w:rPr>
-        <w:t>, as well as unifying all the pipeline</w:t>
-      </w:r>
-      <w:r>
-        <w:rPr>
-          <w:lang w:val="en-GB"/>
-        </w:rPr>
-        <w:t>.</w:t>
-      </w:r>
-    </w:p>
-    <w:p>
-      <w:pPr>
-        <w:pStyle w:val="Prrafodelista"/>
+          <w:rFonts w:asciiTheme="majorHAnsi" w:hAnsiTheme="majorHAnsi" w:cs="Times New Roman"/>
+          <w:sz w:val="22"/>
+          <w:szCs w:val="22"/>
+          <w:lang w:val="en-GB"/>
+        </w:rPr>
+        <w:t>: Conducted initial research and experiments with image captioning models, aiming to extend alert generation capabilities to visual-textual inputs. This included early-stage integration into the existing NLP pipeline.</w:t>
+      </w:r>
+    </w:p>
+    <w:p>
+      <w:pPr>
         <w:numPr>
           <w:ilvl w:val="0"/>
-          <w:numId w:val="2"/>
+          <w:numId w:val="4"/>
         </w:numPr>
-        <w:rPr>
-          <w:lang w:val="en-GB"/>
-        </w:rPr>
-      </w:pPr>
-      <w:r>
-        <w:rPr>
-          <w:b/>
-          <w:bCs/>
+        <w:jc w:val="both"/>
+        <w:rPr>
+          <w:rFonts w:asciiTheme="majorHAnsi" w:hAnsiTheme="majorHAnsi" w:cs="Times New Roman"/>
+          <w:sz w:val="22"/>
+          <w:szCs w:val="22"/>
+          <w:lang w:val="en-GB"/>
+        </w:rPr>
+      </w:pPr>
+      <w:r>
+        <w:rPr>
+          <w:rFonts w:asciiTheme="majorHAnsi" w:hAnsiTheme="majorHAnsi" w:cs="Times New Roman"/>
+          <w:b/>
+          <w:bCs/>
+          <w:sz w:val="22"/>
+          <w:szCs w:val="22"/>
           <w:lang w:val="en-GB"/>
         </w:rPr>
         <w:t>Evaluation and Analysis</w:t>
       </w:r>
       <w:r>
         <w:rPr>
-          <w:lang w:val="en-GB"/>
-        </w:rPr>
-        <w:t>: Interpretation of model outputs, error analysis, prompt refinement, and evaluation of generalization using test cases.</w:t>
-      </w:r>
-    </w:p>
-    <w:p>
-      <w:pPr>
-        <w:pStyle w:val="Prrafodelista"/>
+          <w:rFonts w:asciiTheme="majorHAnsi" w:hAnsiTheme="majorHAnsi" w:cs="Times New Roman"/>
+          <w:sz w:val="22"/>
+          <w:szCs w:val="22"/>
+          <w:lang w:val="en-GB"/>
+        </w:rPr>
+        <w:t>: Performed systematic evaluation of model outputs, including error analysis, prompt refinement, and assessment of generalization across test cases.</w:t>
+      </w:r>
+    </w:p>
+    <w:p>
+      <w:pPr>
         <w:numPr>
           <w:ilvl w:val="0"/>
-          <w:numId w:val="2"/>
+          <w:numId w:val="4"/>
         </w:numPr>
-        <w:rPr>
-          <w:lang w:val="en-GB"/>
-        </w:rPr>
-      </w:pPr>
-      <w:r>
-        <w:rPr>
-          <w:b/>
-          <w:bCs/>
+        <w:jc w:val="both"/>
+        <w:rPr>
+          <w:rFonts w:asciiTheme="majorHAnsi" w:hAnsiTheme="majorHAnsi" w:cs="Times New Roman"/>
+          <w:sz w:val="22"/>
+          <w:szCs w:val="22"/>
+          <w:lang w:val="en-GB"/>
+        </w:rPr>
+      </w:pPr>
+      <w:r>
+        <w:rPr>
+          <w:rFonts w:asciiTheme="majorHAnsi" w:hAnsiTheme="majorHAnsi" w:cs="Times New Roman"/>
+          <w:b/>
+          <w:bCs/>
+          <w:sz w:val="22"/>
+          <w:szCs w:val="22"/>
           <w:lang w:val="en-GB"/>
         </w:rPr>
         <w:t>Writing and Documentation</w:t>
       </w:r>
       <w:r>
         <w:rPr>
-          <w:lang w:val="en-GB"/>
-        </w:rPr>
-        <w:t>:</w:t>
-      </w:r>
-      <w:r>
-        <w:rPr>
-          <w:lang w:val="en-GB"/>
-        </w:rPr>
-        <w:t xml:space="preserve"> </w:t>
-      </w:r>
-      <w:r>
-        <w:rPr>
-          <w:lang w:val="en-GB"/>
-        </w:rPr>
-        <w:t>Preparation of the manuscript, including introduction, methodology, results, conclusion, and future work.</w:t>
-      </w:r>
-    </w:p>
-    <w:p>
-      <w:pPr>
-        <w:pStyle w:val="Prrafodelista"/>
+          <w:rFonts w:asciiTheme="majorHAnsi" w:hAnsiTheme="majorHAnsi" w:cs="Times New Roman"/>
+          <w:sz w:val="22"/>
+          <w:szCs w:val="22"/>
+          <w:lang w:val="en-GB"/>
+        </w:rPr>
+        <w:t>: Led the preparation of the manuscript, covering the introduction, methodology, experimental setup, results, conclusion, and future directions.</w:t>
+      </w:r>
+    </w:p>
+    <w:p>
+      <w:pPr>
         <w:numPr>
           <w:ilvl w:val="0"/>
-          <w:numId w:val="2"/>
+          <w:numId w:val="4"/>
         </w:numPr>
-        <w:rPr>
-          <w:lang w:val="en-GB"/>
-        </w:rPr>
-      </w:pPr>
-      <w:r>
-        <w:rPr>
-          <w:b/>
-          <w:bCs/>
+        <w:jc w:val="both"/>
+        <w:rPr>
+          <w:rFonts w:asciiTheme="majorHAnsi" w:hAnsiTheme="majorHAnsi" w:cs="Times New Roman"/>
+          <w:sz w:val="22"/>
+          <w:szCs w:val="22"/>
+          <w:lang w:val="en-GB"/>
+        </w:rPr>
+      </w:pPr>
+      <w:r>
+        <w:rPr>
+          <w:rFonts w:asciiTheme="majorHAnsi" w:hAnsiTheme="majorHAnsi" w:cs="Times New Roman"/>
+          <w:b/>
+          <w:bCs/>
+          <w:sz w:val="22"/>
+          <w:szCs w:val="22"/>
           <w:lang w:val="en-GB"/>
         </w:rPr>
         <w:t>Technical Infrastructure</w:t>
       </w:r>
       <w:r>
         <w:rPr>
-          <w:lang w:val="en-GB"/>
-        </w:rPr>
-        <w:t>:</w:t>
-      </w:r>
-      <w:r>
-        <w:rPr>
-          <w:lang w:val="en-GB"/>
+          <w:rFonts w:asciiTheme="majorHAnsi" w:hAnsiTheme="majorHAnsi" w:cs="Times New Roman"/>
+          <w:sz w:val="22"/>
+          <w:szCs w:val="22"/>
+          <w:lang w:val="en-GB"/>
+        </w:rPr>
+        <w:t xml:space="preserve">: </w:t>
+      </w:r>
+      <w:r>
+        <w:rPr>
+          <w:rFonts w:asciiTheme="majorHAnsi" w:hAnsiTheme="majorHAnsi" w:cs="Times New Roman"/>
+          <w:sz w:val="22"/>
+          <w:szCs w:val="22"/>
+          <w:lang w:val="en-GB"/>
+        </w:rPr>
+        <w:t>Managed development environments</w:t>
+      </w:r>
+      <w:r>
+        <w:rPr>
+          <w:rFonts w:asciiTheme="majorHAnsi" w:hAnsiTheme="majorHAnsi" w:cs="Times New Roman"/>
+          <w:sz w:val="22"/>
+          <w:szCs w:val="22"/>
+          <w:lang w:val="en-GB"/>
+        </w:rPr>
+        <w:t xml:space="preserve"> implemented runtime and token authentication strategies (e.g., for </w:t>
+      </w:r>
+      <w:proofErr w:type="spellStart"/>
+      <w:r>
+        <w:rPr>
+          <w:rFonts w:asciiTheme="majorHAnsi" w:hAnsiTheme="majorHAnsi" w:cs="Times New Roman"/>
+          <w:sz w:val="22"/>
+          <w:szCs w:val="22"/>
+          <w:lang w:val="en-GB"/>
+        </w:rPr>
+        <w:t>HuggingFace</w:t>
+      </w:r>
+      <w:proofErr w:type="spellEnd"/>
+      <w:r>
+        <w:rPr>
+          <w:rFonts w:asciiTheme="majorHAnsi" w:hAnsiTheme="majorHAnsi" w:cs="Times New Roman"/>
+          <w:sz w:val="22"/>
+          <w:szCs w:val="22"/>
+          <w:lang w:val="en-GB"/>
+        </w:rPr>
+        <w:t>), created infrastructure for reproducible experiments, and maintained shared codebases and documentation.</w:t>
+      </w:r>
+    </w:p>
+    <w:p>
+      <w:pPr>
+        <w:jc w:val="both"/>
+        <w:rPr>
+          <w:rFonts w:asciiTheme="majorHAnsi" w:hAnsiTheme="majorHAnsi" w:cs="Times New Roman"/>
+          <w:sz w:val="22"/>
+          <w:szCs w:val="22"/>
+          <w:lang w:val="en-GB"/>
+        </w:rPr>
+      </w:pPr>
+      <w:r>
+        <w:rPr>
+          <w:rFonts w:asciiTheme="majorHAnsi" w:hAnsiTheme="majorHAnsi" w:cs="Times New Roman"/>
+          <w:sz w:val="22"/>
+          <w:szCs w:val="22"/>
+          <w:lang w:val="en-GB"/>
+        </w:rPr>
+        <w:t>All team members were involved in continuous discussion, brainstorming, and iterative refinement of the project across all stages.</w:t>
+      </w:r>
+    </w:p>
+    <w:p>
+      <w:pPr>
+        <w:jc w:val="both"/>
+        <w:rPr>
+          <w:rFonts w:asciiTheme="majorHAnsi" w:hAnsiTheme="majorHAnsi" w:cs="Times New Roman"/>
+          <w:sz w:val="22"/>
+          <w:szCs w:val="22"/>
+          <w:lang w:val="en-GB"/>
+        </w:rPr>
+      </w:pPr>
+    </w:p>
+    <w:p>
+      <w:pPr>
+        <w:jc w:val="both"/>
+        <w:rPr>
+          <w:rFonts w:asciiTheme="majorHAnsi" w:hAnsiTheme="majorHAnsi" w:cs="Times New Roman"/>
+          <w:sz w:val="22"/>
+          <w:szCs w:val="22"/>
+          <w:lang w:val="en-GB"/>
+        </w:rPr>
+      </w:pPr>
+    </w:p>
+    <w:p>
+      <w:pPr>
+        <w:jc w:val="both"/>
+        <w:rPr>
+          <w:rFonts w:asciiTheme="majorHAnsi" w:hAnsiTheme="majorHAnsi" w:cs="Times New Roman"/>
+          <w:sz w:val="22"/>
+          <w:szCs w:val="22"/>
+          <w:lang w:val="en-GB"/>
+        </w:rPr>
+      </w:pPr>
+    </w:p>
+    <w:p>
+      <w:pPr>
+        <w:jc w:val="both"/>
+        <w:rPr>
+          <w:rFonts w:asciiTheme="majorHAnsi" w:hAnsiTheme="majorHAnsi" w:cs="Times New Roman"/>
+          <w:sz w:val="22"/>
+          <w:szCs w:val="22"/>
+          <w:lang w:val="en-GB"/>
+        </w:rPr>
+      </w:pPr>
+    </w:p>
+    <w:p>
+      <w:pPr>
+        <w:jc w:val="both"/>
+        <w:rPr>
+          <w:rFonts w:asciiTheme="majorHAnsi" w:hAnsiTheme="majorHAnsi" w:cs="Times New Roman"/>
+          <w:sz w:val="22"/>
+          <w:szCs w:val="22"/>
+          <w:lang w:val="en-GB"/>
+        </w:rPr>
+      </w:pPr>
+    </w:p>
+    <w:p>
+      <w:pPr>
+        <w:jc w:val="both"/>
+        <w:rPr>
+          <w:rFonts w:asciiTheme="majorHAnsi" w:hAnsiTheme="majorHAnsi" w:cs="Times New Roman"/>
+          <w:b/>
+          <w:bCs/>
+          <w:sz w:val="22"/>
+          <w:szCs w:val="22"/>
+        </w:rPr>
+      </w:pPr>
+      <w:r>
+        <w:rPr>
+          <w:rFonts w:asciiTheme="majorHAnsi" w:hAnsiTheme="majorHAnsi" w:cs="Times New Roman"/>
+          <w:b/>
+          <w:bCs/>
+          <w:sz w:val="22"/>
+          <w:szCs w:val="22"/>
+        </w:rPr>
+        <w:lastRenderedPageBreak/>
+        <w:t>Individual Contributions</w:t>
+      </w:r>
+    </w:p>
+    <w:p>
+      <w:pPr>
+        <w:numPr>
+          <w:ilvl w:val="0"/>
+          <w:numId w:val="5"/>
+        </w:numPr>
+        <w:jc w:val="both"/>
+        <w:rPr>
+          <w:rFonts w:asciiTheme="majorHAnsi" w:hAnsiTheme="majorHAnsi" w:cs="Times New Roman"/>
+          <w:sz w:val="22"/>
+          <w:szCs w:val="22"/>
+          <w:lang w:val="en-GB"/>
+        </w:rPr>
+      </w:pPr>
+      <w:r>
+        <w:rPr>
+          <w:rFonts w:asciiTheme="majorHAnsi" w:hAnsiTheme="majorHAnsi" w:cs="Times New Roman"/>
+          <w:b/>
+          <w:bCs/>
+          <w:sz w:val="22"/>
+          <w:szCs w:val="22"/>
+          <w:lang w:val="en-GB"/>
+        </w:rPr>
+        <w:t>Ulises</w:t>
+      </w:r>
+      <w:r>
+        <w:rPr>
+          <w:rFonts w:asciiTheme="majorHAnsi" w:hAnsiTheme="majorHAnsi" w:cs="Times New Roman"/>
+          <w:sz w:val="22"/>
+          <w:szCs w:val="22"/>
+          <w:lang w:val="en-GB"/>
+        </w:rPr>
+        <w:t xml:space="preserve"> served as project leader, coordinating the team’s efforts, defining the scope and architecture, contributing to sentiment analysis development, managing infrastructure, and revising documentation.</w:t>
+      </w:r>
+    </w:p>
+    <w:p>
+      <w:pPr>
+        <w:numPr>
+          <w:ilvl w:val="0"/>
+          <w:numId w:val="5"/>
+        </w:numPr>
+        <w:jc w:val="both"/>
+        <w:rPr>
+          <w:rFonts w:asciiTheme="majorHAnsi" w:hAnsiTheme="majorHAnsi" w:cs="Times New Roman"/>
+          <w:sz w:val="22"/>
+          <w:szCs w:val="22"/>
+          <w:lang w:val="en-GB"/>
+        </w:rPr>
+      </w:pPr>
+      <w:r>
+        <w:rPr>
+          <w:rFonts w:asciiTheme="majorHAnsi" w:hAnsiTheme="majorHAnsi" w:cs="Times New Roman"/>
+          <w:b/>
+          <w:bCs/>
+          <w:sz w:val="22"/>
+          <w:szCs w:val="22"/>
+          <w:lang w:val="en-GB"/>
+        </w:rPr>
+        <w:t>Teresa</w:t>
+      </w:r>
+      <w:r>
+        <w:rPr>
+          <w:rFonts w:asciiTheme="majorHAnsi" w:hAnsiTheme="majorHAnsi" w:cs="Times New Roman"/>
+          <w:sz w:val="22"/>
+          <w:szCs w:val="22"/>
+          <w:lang w:val="en-GB"/>
+        </w:rPr>
+        <w:t xml:space="preserve"> led the Alert Generation module, contributed to the project design and manuscript development, and played a key role in maintaining technical infrastructure.</w:t>
+      </w:r>
+    </w:p>
+    <w:p>
+      <w:pPr>
+        <w:numPr>
+          <w:ilvl w:val="0"/>
+          <w:numId w:val="5"/>
+        </w:numPr>
+        <w:jc w:val="both"/>
+        <w:rPr>
+          <w:rFonts w:asciiTheme="majorHAnsi" w:hAnsiTheme="majorHAnsi" w:cs="Times New Roman"/>
+          <w:sz w:val="22"/>
+          <w:szCs w:val="22"/>
+        </w:rPr>
+      </w:pPr>
+      <w:r>
+        <w:rPr>
+          <w:rFonts w:asciiTheme="majorHAnsi" w:hAnsiTheme="majorHAnsi" w:cs="Times New Roman"/>
+          <w:b/>
+          <w:bCs/>
+          <w:sz w:val="22"/>
+          <w:szCs w:val="22"/>
+          <w:lang w:val="en-GB"/>
+        </w:rPr>
+        <w:t>María</w:t>
+      </w:r>
+      <w:r>
+        <w:rPr>
+          <w:rFonts w:asciiTheme="majorHAnsi" w:hAnsiTheme="majorHAnsi" w:cs="Times New Roman"/>
+          <w:sz w:val="22"/>
+          <w:szCs w:val="22"/>
+          <w:lang w:val="en-GB"/>
+        </w:rPr>
+        <w:t xml:space="preserve"> focused on the pipeline implementation and multimodal integration via image captioning. </w:t>
+      </w:r>
+      <w:proofErr w:type="spellStart"/>
+      <w:r>
+        <w:rPr>
+          <w:rFonts w:asciiTheme="majorHAnsi" w:hAnsiTheme="majorHAnsi" w:cs="Times New Roman"/>
+          <w:sz w:val="22"/>
+          <w:szCs w:val="22"/>
+        </w:rPr>
+        <w:t>She</w:t>
+      </w:r>
+      <w:proofErr w:type="spellEnd"/>
+      <w:r>
+        <w:rPr>
+          <w:rFonts w:asciiTheme="majorHAnsi" w:hAnsiTheme="majorHAnsi" w:cs="Times New Roman"/>
+          <w:sz w:val="22"/>
+          <w:szCs w:val="22"/>
         </w:rPr>
         <w:t xml:space="preserve"> </w:t>
       </w:r>
-      <w:r>
-        <w:rPr>
-          <w:lang w:val="en-GB"/>
-        </w:rPr>
-        <w:t>Management of environments, , HuggingFace access/authentication, and runtime optimization.</w:t>
-      </w:r>
-    </w:p>
-    <w:p>
-      <w:pPr>
-        <w:rPr>
-          <w:lang w:val="en-GB"/>
-        </w:rPr>
-      </w:pPr>
-    </w:p>
-    <w:p>
-      <w:pPr>
-        <w:rPr>
-          <w:lang w:val="en-GB"/>
-        </w:rPr>
-      </w:pPr>
-      <w:r>
-        <w:rPr>
-          <w:lang w:val="en-GB"/>
-        </w:rPr>
-        <w:t>All team members contributed to discussion, refinement of ideas, and iterative development throughout the project lifecycle.</w:t>
-      </w:r>
-    </w:p>
-    <w:tbl>
-      <w:tblPr>
-        <w:tblStyle w:val="Tablaconcuadrcula"/>
-        <w:tblW w:w="0" w:type="auto"/>
-        <w:tblLook w:val="04A0" w:firstRow="1" w:lastRow="0" w:firstColumn="1" w:lastColumn="0" w:noHBand="0" w:noVBand="1"/>
-      </w:tblPr>
-      <w:tblGrid>
-        <w:gridCol w:w="2123"/>
-        <w:gridCol w:w="2123"/>
-        <w:gridCol w:w="2124"/>
-        <w:gridCol w:w="2124"/>
-      </w:tblGrid>
-      <w:tr>
-        <w:tc>
-          <w:tcPr>
-            <w:tcW w:w="2123" w:type="dxa"/>
-          </w:tcPr>
-          <w:p>
-            <w:pPr>
-              <w:rPr>
-                <w:lang w:val="en-GB"/>
-              </w:rPr>
-            </w:pPr>
-          </w:p>
-        </w:tc>
-        <w:tc>
-          <w:tcPr>
-            <w:tcW w:w="2123" w:type="dxa"/>
-          </w:tcPr>
-          <w:p>
-            <w:pPr>
-              <w:rPr>
-                <w:lang w:val="en-GB"/>
-              </w:rPr>
-            </w:pPr>
-          </w:p>
-        </w:tc>
-        <w:tc>
-          <w:tcPr>
-            <w:tcW w:w="2124" w:type="dxa"/>
-          </w:tcPr>
-          <w:p>
-            <w:pPr>
-              <w:rPr>
-                <w:lang w:val="en-GB"/>
-              </w:rPr>
-            </w:pPr>
-          </w:p>
-        </w:tc>
-        <w:tc>
-          <w:tcPr>
-            <w:tcW w:w="2124" w:type="dxa"/>
-          </w:tcPr>
-          <w:p>
-            <w:pPr>
-              <w:rPr>
-                <w:lang w:val="en-GB"/>
-              </w:rPr>
-            </w:pPr>
-          </w:p>
-        </w:tc>
-      </w:tr>
-      <w:tr>
-        <w:tc>
-          <w:tcPr>
-            <w:tcW w:w="2123" w:type="dxa"/>
-          </w:tcPr>
-          <w:p>
-            <w:pPr>
-              <w:rPr>
-                <w:lang w:val="en-GB"/>
-              </w:rPr>
-            </w:pPr>
-          </w:p>
-        </w:tc>
-        <w:tc>
-          <w:tcPr>
-            <w:tcW w:w="2123" w:type="dxa"/>
-          </w:tcPr>
-          <w:p>
-            <w:pPr>
-              <w:rPr>
-                <w:lang w:val="en-GB"/>
-              </w:rPr>
-            </w:pPr>
-          </w:p>
-        </w:tc>
-        <w:tc>
-          <w:tcPr>
-            <w:tcW w:w="2124" w:type="dxa"/>
-          </w:tcPr>
-          <w:p>
-            <w:pPr>
-              <w:rPr>
-                <w:lang w:val="en-GB"/>
-              </w:rPr>
-            </w:pPr>
-          </w:p>
-        </w:tc>
-        <w:tc>
-          <w:tcPr>
-            <w:tcW w:w="2124" w:type="dxa"/>
-          </w:tcPr>
-          <w:p>
-            <w:pPr>
-              <w:rPr>
-                <w:lang w:val="en-GB"/>
-              </w:rPr>
-            </w:pPr>
-          </w:p>
-        </w:tc>
-      </w:tr>
-      <w:tr>
-        <w:tc>
-          <w:tcPr>
-            <w:tcW w:w="2123" w:type="dxa"/>
-          </w:tcPr>
-          <w:p>
-            <w:pPr>
-              <w:rPr>
-                <w:lang w:val="en-GB"/>
-              </w:rPr>
-            </w:pPr>
-          </w:p>
-        </w:tc>
-        <w:tc>
-          <w:tcPr>
-            <w:tcW w:w="2123" w:type="dxa"/>
-          </w:tcPr>
-          <w:p>
-            <w:pPr>
-              <w:rPr>
-                <w:lang w:val="en-GB"/>
-              </w:rPr>
-            </w:pPr>
-          </w:p>
-        </w:tc>
-        <w:tc>
-          <w:tcPr>
-            <w:tcW w:w="2124" w:type="dxa"/>
-          </w:tcPr>
-          <w:p>
-            <w:pPr>
-              <w:rPr>
-                <w:lang w:val="en-GB"/>
-              </w:rPr>
-            </w:pPr>
-          </w:p>
-        </w:tc>
-        <w:tc>
-          <w:tcPr>
-            <w:tcW w:w="2124" w:type="dxa"/>
-          </w:tcPr>
-          <w:p>
-            <w:pPr>
-              <w:rPr>
-                <w:lang w:val="en-GB"/>
-              </w:rPr>
-            </w:pPr>
-          </w:p>
-        </w:tc>
-      </w:tr>
-      <w:tr>
-        <w:tc>
-          <w:tcPr>
-            <w:tcW w:w="2123" w:type="dxa"/>
-          </w:tcPr>
-          <w:p>
-            <w:pPr>
-              <w:rPr>
-                <w:lang w:val="en-GB"/>
-              </w:rPr>
-            </w:pPr>
-          </w:p>
-        </w:tc>
-        <w:tc>
-          <w:tcPr>
-            <w:tcW w:w="2123" w:type="dxa"/>
-          </w:tcPr>
-          <w:p>
-            <w:pPr>
-              <w:rPr>
-                <w:lang w:val="en-GB"/>
-              </w:rPr>
-            </w:pPr>
-          </w:p>
-        </w:tc>
-        <w:tc>
-          <w:tcPr>
-            <w:tcW w:w="2124" w:type="dxa"/>
-          </w:tcPr>
-          <w:p>
-            <w:pPr>
-              <w:rPr>
-                <w:lang w:val="en-GB"/>
-              </w:rPr>
-            </w:pPr>
-          </w:p>
-        </w:tc>
-        <w:tc>
-          <w:tcPr>
-            <w:tcW w:w="2124" w:type="dxa"/>
-          </w:tcPr>
-          <w:p>
-            <w:pPr>
-              <w:rPr>
-                <w:lang w:val="en-GB"/>
-              </w:rPr>
-            </w:pPr>
-          </w:p>
-        </w:tc>
-      </w:tr>
-    </w:tbl>
-    <w:p>
-      <w:pPr>
-        <w:rPr>
+      <w:proofErr w:type="spellStart"/>
+      <w:r>
+        <w:rPr>
+          <w:rFonts w:asciiTheme="majorHAnsi" w:hAnsiTheme="majorHAnsi" w:cs="Times New Roman"/>
+          <w:sz w:val="22"/>
+          <w:szCs w:val="22"/>
+        </w:rPr>
+        <w:t>also</w:t>
+      </w:r>
+      <w:proofErr w:type="spellEnd"/>
+      <w:r>
+        <w:rPr>
+          <w:rFonts w:asciiTheme="majorHAnsi" w:hAnsiTheme="majorHAnsi" w:cs="Times New Roman"/>
+          <w:sz w:val="22"/>
+          <w:szCs w:val="22"/>
+        </w:rPr>
+        <w:t xml:space="preserve"> </w:t>
+      </w:r>
+      <w:proofErr w:type="spellStart"/>
+      <w:r>
+        <w:rPr>
+          <w:rFonts w:asciiTheme="majorHAnsi" w:hAnsiTheme="majorHAnsi" w:cs="Times New Roman"/>
+          <w:sz w:val="22"/>
+          <w:szCs w:val="22"/>
+        </w:rPr>
+        <w:t>contributed</w:t>
+      </w:r>
+      <w:proofErr w:type="spellEnd"/>
+      <w:r>
+        <w:rPr>
+          <w:rFonts w:asciiTheme="majorHAnsi" w:hAnsiTheme="majorHAnsi" w:cs="Times New Roman"/>
+          <w:sz w:val="22"/>
+          <w:szCs w:val="22"/>
+        </w:rPr>
+        <w:t xml:space="preserve"> </w:t>
+      </w:r>
+      <w:proofErr w:type="spellStart"/>
+      <w:r>
+        <w:rPr>
+          <w:rFonts w:asciiTheme="majorHAnsi" w:hAnsiTheme="majorHAnsi" w:cs="Times New Roman"/>
+          <w:sz w:val="22"/>
+          <w:szCs w:val="22"/>
+        </w:rPr>
+        <w:t>extensively</w:t>
+      </w:r>
+      <w:proofErr w:type="spellEnd"/>
+      <w:r>
+        <w:rPr>
+          <w:rFonts w:asciiTheme="majorHAnsi" w:hAnsiTheme="majorHAnsi" w:cs="Times New Roman"/>
+          <w:sz w:val="22"/>
+          <w:szCs w:val="22"/>
+        </w:rPr>
+        <w:t xml:space="preserve"> </w:t>
+      </w:r>
+      <w:proofErr w:type="spellStart"/>
+      <w:r>
+        <w:rPr>
+          <w:rFonts w:asciiTheme="majorHAnsi" w:hAnsiTheme="majorHAnsi" w:cs="Times New Roman"/>
+          <w:sz w:val="22"/>
+          <w:szCs w:val="22"/>
+        </w:rPr>
+        <w:t>to</w:t>
+      </w:r>
+      <w:proofErr w:type="spellEnd"/>
+      <w:r>
+        <w:rPr>
+          <w:rFonts w:asciiTheme="majorHAnsi" w:hAnsiTheme="majorHAnsi" w:cs="Times New Roman"/>
+          <w:sz w:val="22"/>
+          <w:szCs w:val="22"/>
+        </w:rPr>
+        <w:t xml:space="preserve"> </w:t>
+      </w:r>
+      <w:proofErr w:type="spellStart"/>
+      <w:r>
+        <w:rPr>
+          <w:rFonts w:asciiTheme="majorHAnsi" w:hAnsiTheme="majorHAnsi" w:cs="Times New Roman"/>
+          <w:sz w:val="22"/>
+          <w:szCs w:val="22"/>
+        </w:rPr>
+        <w:t>the</w:t>
+      </w:r>
+      <w:proofErr w:type="spellEnd"/>
+      <w:r>
+        <w:rPr>
+          <w:rFonts w:asciiTheme="majorHAnsi" w:hAnsiTheme="majorHAnsi" w:cs="Times New Roman"/>
+          <w:sz w:val="22"/>
+          <w:szCs w:val="22"/>
+        </w:rPr>
+        <w:t xml:space="preserve"> </w:t>
+      </w:r>
+      <w:proofErr w:type="spellStart"/>
+      <w:r>
+        <w:rPr>
+          <w:rFonts w:asciiTheme="majorHAnsi" w:hAnsiTheme="majorHAnsi" w:cs="Times New Roman"/>
+          <w:sz w:val="22"/>
+          <w:szCs w:val="22"/>
+        </w:rPr>
+        <w:t>manuscript</w:t>
+      </w:r>
+      <w:proofErr w:type="spellEnd"/>
+      <w:r>
+        <w:rPr>
+          <w:rFonts w:asciiTheme="majorHAnsi" w:hAnsiTheme="majorHAnsi" w:cs="Times New Roman"/>
+          <w:sz w:val="22"/>
+          <w:szCs w:val="22"/>
+        </w:rPr>
+        <w:t xml:space="preserve"> and </w:t>
+      </w:r>
+      <w:proofErr w:type="spellStart"/>
+      <w:r>
+        <w:rPr>
+          <w:rFonts w:asciiTheme="majorHAnsi" w:hAnsiTheme="majorHAnsi" w:cs="Times New Roman"/>
+          <w:sz w:val="22"/>
+          <w:szCs w:val="22"/>
+        </w:rPr>
+        <w:t>infrastructure</w:t>
+      </w:r>
+      <w:proofErr w:type="spellEnd"/>
+      <w:r>
+        <w:rPr>
+          <w:rFonts w:asciiTheme="majorHAnsi" w:hAnsiTheme="majorHAnsi" w:cs="Times New Roman"/>
+          <w:sz w:val="22"/>
+          <w:szCs w:val="22"/>
+        </w:rPr>
+        <w:t>.</w:t>
+      </w:r>
+    </w:p>
+    <w:p>
+      <w:pPr>
+        <w:numPr>
+          <w:ilvl w:val="0"/>
+          <w:numId w:val="5"/>
+        </w:numPr>
+        <w:jc w:val="both"/>
+        <w:rPr>
+          <w:rFonts w:asciiTheme="majorHAnsi" w:hAnsiTheme="majorHAnsi" w:cs="Times New Roman"/>
+          <w:sz w:val="22"/>
+          <w:szCs w:val="22"/>
+        </w:rPr>
+      </w:pPr>
+      <w:r>
+        <w:rPr>
+          <w:rFonts w:asciiTheme="majorHAnsi" w:hAnsiTheme="majorHAnsi" w:cs="Times New Roman"/>
+          <w:b/>
+          <w:bCs/>
+          <w:sz w:val="22"/>
+          <w:szCs w:val="22"/>
+          <w:lang w:val="en-GB"/>
+        </w:rPr>
+        <w:t>Ignacio</w:t>
+      </w:r>
+      <w:r>
+        <w:rPr>
+          <w:rFonts w:asciiTheme="majorHAnsi" w:hAnsiTheme="majorHAnsi" w:cs="Times New Roman"/>
+          <w:sz w:val="22"/>
+          <w:szCs w:val="22"/>
+          <w:lang w:val="en-GB"/>
+        </w:rPr>
+        <w:t xml:space="preserve"> implemented the NER model and conducted detailed evaluation and analysis. </w:t>
+      </w:r>
+      <w:r>
+        <w:rPr>
+          <w:rFonts w:asciiTheme="majorHAnsi" w:hAnsiTheme="majorHAnsi" w:cs="Times New Roman"/>
+          <w:sz w:val="22"/>
+          <w:szCs w:val="22"/>
+        </w:rPr>
+        <w:t xml:space="preserve">He </w:t>
+      </w:r>
+      <w:proofErr w:type="spellStart"/>
+      <w:r>
+        <w:rPr>
+          <w:rFonts w:asciiTheme="majorHAnsi" w:hAnsiTheme="majorHAnsi" w:cs="Times New Roman"/>
+          <w:sz w:val="22"/>
+          <w:szCs w:val="22"/>
+        </w:rPr>
+        <w:t>also</w:t>
+      </w:r>
+      <w:proofErr w:type="spellEnd"/>
+      <w:r>
+        <w:rPr>
+          <w:rFonts w:asciiTheme="majorHAnsi" w:hAnsiTheme="majorHAnsi" w:cs="Times New Roman"/>
+          <w:sz w:val="22"/>
+          <w:szCs w:val="22"/>
+        </w:rPr>
+        <w:t xml:space="preserve"> </w:t>
+      </w:r>
+      <w:proofErr w:type="spellStart"/>
+      <w:r>
+        <w:rPr>
+          <w:rFonts w:asciiTheme="majorHAnsi" w:hAnsiTheme="majorHAnsi" w:cs="Times New Roman"/>
+          <w:sz w:val="22"/>
+          <w:szCs w:val="22"/>
+        </w:rPr>
+        <w:t>handled</w:t>
+      </w:r>
+      <w:proofErr w:type="spellEnd"/>
+      <w:r>
+        <w:rPr>
+          <w:rFonts w:asciiTheme="majorHAnsi" w:hAnsiTheme="majorHAnsi" w:cs="Times New Roman"/>
+          <w:sz w:val="22"/>
+          <w:szCs w:val="22"/>
+        </w:rPr>
+        <w:t xml:space="preserve"> </w:t>
+      </w:r>
+      <w:proofErr w:type="spellStart"/>
+      <w:r>
+        <w:rPr>
+          <w:rFonts w:asciiTheme="majorHAnsi" w:hAnsiTheme="majorHAnsi" w:cs="Times New Roman"/>
+          <w:sz w:val="22"/>
+          <w:szCs w:val="22"/>
+        </w:rPr>
+        <w:t>preprocessing</w:t>
+      </w:r>
+      <w:proofErr w:type="spellEnd"/>
+      <w:r>
+        <w:rPr>
+          <w:rFonts w:asciiTheme="majorHAnsi" w:hAnsiTheme="majorHAnsi" w:cs="Times New Roman"/>
+          <w:sz w:val="22"/>
+          <w:szCs w:val="22"/>
+        </w:rPr>
+        <w:t xml:space="preserve"> </w:t>
+      </w:r>
+      <w:proofErr w:type="spellStart"/>
+      <w:r>
+        <w:rPr>
+          <w:rFonts w:asciiTheme="majorHAnsi" w:hAnsiTheme="majorHAnsi" w:cs="Times New Roman"/>
+          <w:sz w:val="22"/>
+          <w:szCs w:val="22"/>
+        </w:rPr>
+        <w:t>tasks</w:t>
+      </w:r>
+      <w:proofErr w:type="spellEnd"/>
+      <w:r>
+        <w:rPr>
+          <w:rFonts w:asciiTheme="majorHAnsi" w:hAnsiTheme="majorHAnsi" w:cs="Times New Roman"/>
+          <w:sz w:val="22"/>
+          <w:szCs w:val="22"/>
+        </w:rPr>
+        <w:t xml:space="preserve"> and </w:t>
+      </w:r>
+      <w:proofErr w:type="spellStart"/>
+      <w:r>
+        <w:rPr>
+          <w:rFonts w:asciiTheme="majorHAnsi" w:hAnsiTheme="majorHAnsi" w:cs="Times New Roman"/>
+          <w:sz w:val="22"/>
+          <w:szCs w:val="22"/>
+        </w:rPr>
+        <w:t>supported</w:t>
+      </w:r>
+      <w:proofErr w:type="spellEnd"/>
+      <w:r>
+        <w:rPr>
+          <w:rFonts w:asciiTheme="majorHAnsi" w:hAnsiTheme="majorHAnsi" w:cs="Times New Roman"/>
+          <w:sz w:val="22"/>
+          <w:szCs w:val="22"/>
+        </w:rPr>
+        <w:t xml:space="preserve"> </w:t>
+      </w:r>
+      <w:proofErr w:type="spellStart"/>
+      <w:r>
+        <w:rPr>
+          <w:rFonts w:asciiTheme="majorHAnsi" w:hAnsiTheme="majorHAnsi" w:cs="Times New Roman"/>
+          <w:sz w:val="22"/>
+          <w:szCs w:val="22"/>
+        </w:rPr>
+        <w:t>documentation</w:t>
+      </w:r>
+      <w:proofErr w:type="spellEnd"/>
+      <w:r>
+        <w:rPr>
+          <w:rFonts w:asciiTheme="majorHAnsi" w:hAnsiTheme="majorHAnsi" w:cs="Times New Roman"/>
+          <w:sz w:val="22"/>
+          <w:szCs w:val="22"/>
+        </w:rPr>
+        <w:t xml:space="preserve"> </w:t>
+      </w:r>
+      <w:proofErr w:type="spellStart"/>
+      <w:r>
+        <w:rPr>
+          <w:rFonts w:asciiTheme="majorHAnsi" w:hAnsiTheme="majorHAnsi" w:cs="Times New Roman"/>
+          <w:sz w:val="22"/>
+          <w:szCs w:val="22"/>
+        </w:rPr>
+        <w:t>efforts</w:t>
+      </w:r>
+      <w:proofErr w:type="spellEnd"/>
+      <w:r>
+        <w:rPr>
+          <w:rFonts w:asciiTheme="majorHAnsi" w:hAnsiTheme="majorHAnsi" w:cs="Times New Roman"/>
+          <w:sz w:val="22"/>
+          <w:szCs w:val="22"/>
+        </w:rPr>
+        <w:t>.</w:t>
+      </w:r>
+    </w:p>
+    <w:p>
+      <w:pPr>
+        <w:jc w:val="both"/>
+        <w:rPr>
+          <w:rFonts w:ascii="Times New Roman" w:hAnsi="Times New Roman" w:cs="Times New Roman"/>
+          <w:sz w:val="22"/>
+          <w:szCs w:val="22"/>
           <w:lang w:val="en-GB"/>
         </w:rPr>
       </w:pPr>
@@ -1183,6 +1607,380 @@
     </w:lvl>
   </w:abstractNum>
   <w:abstractNum w:abstractNumId="1" w15:restartNumberingAfterBreak="0">
+    <w:nsid w:val="4FEC482B"/>
+    <w:multiLevelType w:val="multilevel"/>
+    <w:tmpl w:val="B35E95A8"/>
+    <w:lvl w:ilvl="0">
+      <w:start w:val="1"/>
+      <w:numFmt w:val="bullet"/>
+      <w:lvlText w:val=""/>
+      <w:lvlJc w:val="left"/>
+      <w:pPr>
+        <w:tabs>
+          <w:tab w:val="num" w:pos="720"/>
+        </w:tabs>
+        <w:ind w:left="720" w:hanging="360"/>
+      </w:pPr>
+      <w:rPr>
+        <w:rFonts w:ascii="Symbol" w:hAnsi="Symbol" w:hint="default"/>
+        <w:sz w:val="20"/>
+      </w:rPr>
+    </w:lvl>
+    <w:lvl w:ilvl="1" w:tentative="1">
+      <w:start w:val="1"/>
+      <w:numFmt w:val="bullet"/>
+      <w:lvlText w:val="o"/>
+      <w:lvlJc w:val="left"/>
+      <w:pPr>
+        <w:tabs>
+          <w:tab w:val="num" w:pos="1440"/>
+        </w:tabs>
+        <w:ind w:left="1440" w:hanging="360"/>
+      </w:pPr>
+      <w:rPr>
+        <w:rFonts w:ascii="Courier New" w:hAnsi="Courier New" w:hint="default"/>
+        <w:sz w:val="20"/>
+      </w:rPr>
+    </w:lvl>
+    <w:lvl w:ilvl="2" w:tentative="1">
+      <w:start w:val="1"/>
+      <w:numFmt w:val="bullet"/>
+      <w:lvlText w:val=""/>
+      <w:lvlJc w:val="left"/>
+      <w:pPr>
+        <w:tabs>
+          <w:tab w:val="num" w:pos="2160"/>
+        </w:tabs>
+        <w:ind w:left="2160" w:hanging="360"/>
+      </w:pPr>
+      <w:rPr>
+        <w:rFonts w:ascii="Wingdings" w:hAnsi="Wingdings" w:hint="default"/>
+        <w:sz w:val="20"/>
+      </w:rPr>
+    </w:lvl>
+    <w:lvl w:ilvl="3" w:tentative="1">
+      <w:start w:val="1"/>
+      <w:numFmt w:val="bullet"/>
+      <w:lvlText w:val=""/>
+      <w:lvlJc w:val="left"/>
+      <w:pPr>
+        <w:tabs>
+          <w:tab w:val="num" w:pos="2880"/>
+        </w:tabs>
+        <w:ind w:left="2880" w:hanging="360"/>
+      </w:pPr>
+      <w:rPr>
+        <w:rFonts w:ascii="Wingdings" w:hAnsi="Wingdings" w:hint="default"/>
+        <w:sz w:val="20"/>
+      </w:rPr>
+    </w:lvl>
+    <w:lvl w:ilvl="4" w:tentative="1">
+      <w:start w:val="1"/>
+      <w:numFmt w:val="bullet"/>
+      <w:lvlText w:val=""/>
+      <w:lvlJc w:val="left"/>
+      <w:pPr>
+        <w:tabs>
+          <w:tab w:val="num" w:pos="3600"/>
+        </w:tabs>
+        <w:ind w:left="3600" w:hanging="360"/>
+      </w:pPr>
+      <w:rPr>
+        <w:rFonts w:ascii="Wingdings" w:hAnsi="Wingdings" w:hint="default"/>
+        <w:sz w:val="20"/>
+      </w:rPr>
+    </w:lvl>
+    <w:lvl w:ilvl="5" w:tentative="1">
+      <w:start w:val="1"/>
+      <w:numFmt w:val="bullet"/>
+      <w:lvlText w:val=""/>
+      <w:lvlJc w:val="left"/>
+      <w:pPr>
+        <w:tabs>
+          <w:tab w:val="num" w:pos="4320"/>
+        </w:tabs>
+        <w:ind w:left="4320" w:hanging="360"/>
+      </w:pPr>
+      <w:rPr>
+        <w:rFonts w:ascii="Wingdings" w:hAnsi="Wingdings" w:hint="default"/>
+        <w:sz w:val="20"/>
+      </w:rPr>
+    </w:lvl>
+    <w:lvl w:ilvl="6" w:tentative="1">
+      <w:start w:val="1"/>
+      <w:numFmt w:val="bullet"/>
+      <w:lvlText w:val=""/>
+      <w:lvlJc w:val="left"/>
+      <w:pPr>
+        <w:tabs>
+          <w:tab w:val="num" w:pos="5040"/>
+        </w:tabs>
+        <w:ind w:left="5040" w:hanging="360"/>
+      </w:pPr>
+      <w:rPr>
+        <w:rFonts w:ascii="Wingdings" w:hAnsi="Wingdings" w:hint="default"/>
+        <w:sz w:val="20"/>
+      </w:rPr>
+    </w:lvl>
+    <w:lvl w:ilvl="7" w:tentative="1">
+      <w:start w:val="1"/>
+      <w:numFmt w:val="bullet"/>
+      <w:lvlText w:val=""/>
+      <w:lvlJc w:val="left"/>
+      <w:pPr>
+        <w:tabs>
+          <w:tab w:val="num" w:pos="5760"/>
+        </w:tabs>
+        <w:ind w:left="5760" w:hanging="360"/>
+      </w:pPr>
+      <w:rPr>
+        <w:rFonts w:ascii="Wingdings" w:hAnsi="Wingdings" w:hint="default"/>
+        <w:sz w:val="20"/>
+      </w:rPr>
+    </w:lvl>
+    <w:lvl w:ilvl="8" w:tentative="1">
+      <w:start w:val="1"/>
+      <w:numFmt w:val="bullet"/>
+      <w:lvlText w:val=""/>
+      <w:lvlJc w:val="left"/>
+      <w:pPr>
+        <w:tabs>
+          <w:tab w:val="num" w:pos="6480"/>
+        </w:tabs>
+        <w:ind w:left="6480" w:hanging="360"/>
+      </w:pPr>
+      <w:rPr>
+        <w:rFonts w:ascii="Wingdings" w:hAnsi="Wingdings" w:hint="default"/>
+        <w:sz w:val="20"/>
+      </w:rPr>
+    </w:lvl>
+  </w:abstractNum>
+  <w:abstractNum w:abstractNumId="2" w15:restartNumberingAfterBreak="0">
+    <w:nsid w:val="522812E9"/>
+    <w:multiLevelType w:val="multilevel"/>
+    <w:tmpl w:val="3558E71A"/>
+    <w:lvl w:ilvl="0">
+      <w:start w:val="1"/>
+      <w:numFmt w:val="decimal"/>
+      <w:lvlText w:val="%1."/>
+      <w:lvlJc w:val="left"/>
+      <w:pPr>
+        <w:tabs>
+          <w:tab w:val="num" w:pos="720"/>
+        </w:tabs>
+        <w:ind w:left="720" w:hanging="360"/>
+      </w:pPr>
+    </w:lvl>
+    <w:lvl w:ilvl="1" w:tentative="1">
+      <w:start w:val="1"/>
+      <w:numFmt w:val="decimal"/>
+      <w:lvlText w:val="%2."/>
+      <w:lvlJc w:val="left"/>
+      <w:pPr>
+        <w:tabs>
+          <w:tab w:val="num" w:pos="1440"/>
+        </w:tabs>
+        <w:ind w:left="1440" w:hanging="360"/>
+      </w:pPr>
+    </w:lvl>
+    <w:lvl w:ilvl="2" w:tentative="1">
+      <w:start w:val="1"/>
+      <w:numFmt w:val="decimal"/>
+      <w:lvlText w:val="%3."/>
+      <w:lvlJc w:val="left"/>
+      <w:pPr>
+        <w:tabs>
+          <w:tab w:val="num" w:pos="2160"/>
+        </w:tabs>
+        <w:ind w:left="2160" w:hanging="360"/>
+      </w:pPr>
+    </w:lvl>
+    <w:lvl w:ilvl="3" w:tentative="1">
+      <w:start w:val="1"/>
+      <w:numFmt w:val="decimal"/>
+      <w:lvlText w:val="%4."/>
+      <w:lvlJc w:val="left"/>
+      <w:pPr>
+        <w:tabs>
+          <w:tab w:val="num" w:pos="2880"/>
+        </w:tabs>
+        <w:ind w:left="2880" w:hanging="360"/>
+      </w:pPr>
+    </w:lvl>
+    <w:lvl w:ilvl="4" w:tentative="1">
+      <w:start w:val="1"/>
+      <w:numFmt w:val="decimal"/>
+      <w:lvlText w:val="%5."/>
+      <w:lvlJc w:val="left"/>
+      <w:pPr>
+        <w:tabs>
+          <w:tab w:val="num" w:pos="3600"/>
+        </w:tabs>
+        <w:ind w:left="3600" w:hanging="360"/>
+      </w:pPr>
+    </w:lvl>
+    <w:lvl w:ilvl="5" w:tentative="1">
+      <w:start w:val="1"/>
+      <w:numFmt w:val="decimal"/>
+      <w:lvlText w:val="%6."/>
+      <w:lvlJc w:val="left"/>
+      <w:pPr>
+        <w:tabs>
+          <w:tab w:val="num" w:pos="4320"/>
+        </w:tabs>
+        <w:ind w:left="4320" w:hanging="360"/>
+      </w:pPr>
+    </w:lvl>
+    <w:lvl w:ilvl="6" w:tentative="1">
+      <w:start w:val="1"/>
+      <w:numFmt w:val="decimal"/>
+      <w:lvlText w:val="%7."/>
+      <w:lvlJc w:val="left"/>
+      <w:pPr>
+        <w:tabs>
+          <w:tab w:val="num" w:pos="5040"/>
+        </w:tabs>
+        <w:ind w:left="5040" w:hanging="360"/>
+      </w:pPr>
+    </w:lvl>
+    <w:lvl w:ilvl="7" w:tentative="1">
+      <w:start w:val="1"/>
+      <w:numFmt w:val="decimal"/>
+      <w:lvlText w:val="%8."/>
+      <w:lvlJc w:val="left"/>
+      <w:pPr>
+        <w:tabs>
+          <w:tab w:val="num" w:pos="5760"/>
+        </w:tabs>
+        <w:ind w:left="5760" w:hanging="360"/>
+      </w:pPr>
+    </w:lvl>
+    <w:lvl w:ilvl="8" w:tentative="1">
+      <w:start w:val="1"/>
+      <w:numFmt w:val="decimal"/>
+      <w:lvlText w:val="%9."/>
+      <w:lvlJc w:val="left"/>
+      <w:pPr>
+        <w:tabs>
+          <w:tab w:val="num" w:pos="6480"/>
+        </w:tabs>
+        <w:ind w:left="6480" w:hanging="360"/>
+      </w:pPr>
+    </w:lvl>
+  </w:abstractNum>
+  <w:abstractNum w:abstractNumId="3" w15:restartNumberingAfterBreak="0">
+    <w:nsid w:val="64502F01"/>
+    <w:multiLevelType w:val="hybridMultilevel"/>
+    <w:tmpl w:val="202C9A00"/>
+    <w:lvl w:ilvl="0" w:tplc="DEA2AB5A">
+      <w:numFmt w:val="bullet"/>
+      <w:lvlText w:val="-"/>
+      <w:lvlJc w:val="left"/>
+      <w:pPr>
+        <w:ind w:left="720" w:hanging="360"/>
+      </w:pPr>
+      <w:rPr>
+        <w:rFonts w:ascii="Aptos" w:eastAsiaTheme="minorHAnsi" w:hAnsi="Aptos" w:cstheme="minorBidi" w:hint="default"/>
+      </w:rPr>
+    </w:lvl>
+    <w:lvl w:ilvl="1" w:tplc="0C0A0003" w:tentative="1">
+      <w:start w:val="1"/>
+      <w:numFmt w:val="bullet"/>
+      <w:lvlText w:val="o"/>
+      <w:lvlJc w:val="left"/>
+      <w:pPr>
+        <w:ind w:left="1440" w:hanging="360"/>
+      </w:pPr>
+      <w:rPr>
+        <w:rFonts w:ascii="Courier New" w:hAnsi="Courier New" w:cs="Courier New" w:hint="default"/>
+      </w:rPr>
+    </w:lvl>
+    <w:lvl w:ilvl="2" w:tplc="0C0A0005" w:tentative="1">
+      <w:start w:val="1"/>
+      <w:numFmt w:val="bullet"/>
+      <w:lvlText w:val=""/>
+      <w:lvlJc w:val="left"/>
+      <w:pPr>
+        <w:ind w:left="2160" w:hanging="360"/>
+      </w:pPr>
+      <w:rPr>
+        <w:rFonts w:ascii="Wingdings" w:hAnsi="Wingdings" w:hint="default"/>
+      </w:rPr>
+    </w:lvl>
+    <w:lvl w:ilvl="3" w:tplc="0C0A0001" w:tentative="1">
+      <w:start w:val="1"/>
+      <w:numFmt w:val="bullet"/>
+      <w:lvlText w:val=""/>
+      <w:lvlJc w:val="left"/>
+      <w:pPr>
+        <w:ind w:left="2880" w:hanging="360"/>
+      </w:pPr>
+      <w:rPr>
+        <w:rFonts w:ascii="Symbol" w:hAnsi="Symbol" w:hint="default"/>
+      </w:rPr>
+    </w:lvl>
+    <w:lvl w:ilvl="4" w:tplc="0C0A0003" w:tentative="1">
+      <w:start w:val="1"/>
+      <w:numFmt w:val="bullet"/>
+      <w:lvlText w:val="o"/>
+      <w:lvlJc w:val="left"/>
+      <w:pPr>
+        <w:ind w:left="3600" w:hanging="360"/>
+      </w:pPr>
+      <w:rPr>
+        <w:rFonts w:ascii="Courier New" w:hAnsi="Courier New" w:cs="Courier New" w:hint="default"/>
+      </w:rPr>
+    </w:lvl>
+    <w:lvl w:ilvl="5" w:tplc="0C0A0005" w:tentative="1">
+      <w:start w:val="1"/>
+      <w:numFmt w:val="bullet"/>
+      <w:lvlText w:val=""/>
+      <w:lvlJc w:val="left"/>
+      <w:pPr>
+        <w:ind w:left="4320" w:hanging="360"/>
+      </w:pPr>
+      <w:rPr>
+        <w:rFonts w:ascii="Wingdings" w:hAnsi="Wingdings" w:hint="default"/>
+      </w:rPr>
+    </w:lvl>
+    <w:lvl w:ilvl="6" w:tplc="0C0A0001" w:tentative="1">
+      <w:start w:val="1"/>
+      <w:numFmt w:val="bullet"/>
+      <w:lvlText w:val=""/>
+      <w:lvlJc w:val="left"/>
+      <w:pPr>
+        <w:ind w:left="5040" w:hanging="360"/>
+      </w:pPr>
+      <w:rPr>
+        <w:rFonts w:ascii="Symbol" w:hAnsi="Symbol" w:hint="default"/>
+      </w:rPr>
+    </w:lvl>
+    <w:lvl w:ilvl="7" w:tplc="0C0A0003" w:tentative="1">
+      <w:start w:val="1"/>
+      <w:numFmt w:val="bullet"/>
+      <w:lvlText w:val="o"/>
+      <w:lvlJc w:val="left"/>
+      <w:pPr>
+        <w:ind w:left="5760" w:hanging="360"/>
+      </w:pPr>
+      <w:rPr>
+        <w:rFonts w:ascii="Courier New" w:hAnsi="Courier New" w:cs="Courier New" w:hint="default"/>
+      </w:rPr>
+    </w:lvl>
+    <w:lvl w:ilvl="8" w:tplc="0C0A0005" w:tentative="1">
+      <w:start w:val="1"/>
+      <w:numFmt w:val="bullet"/>
+      <w:lvlText w:val=""/>
+      <w:lvlJc w:val="left"/>
+      <w:pPr>
+        <w:ind w:left="6480" w:hanging="360"/>
+      </w:pPr>
+      <w:rPr>
+        <w:rFonts w:ascii="Wingdings" w:hAnsi="Wingdings" w:hint="default"/>
+      </w:rPr>
+    </w:lvl>
+  </w:abstractNum>
+  <w:abstractNum w:abstractNumId="4" w15:restartNumberingAfterBreak="0">
     <w:nsid w:val="7B1C2EFA"/>
     <w:multiLevelType w:val="hybridMultilevel"/>
     <w:tmpl w:val="B90C8AD6"/>
@@ -1296,10 +2094,19 @@
     </w:lvl>
   </w:abstractNum>
   <w:num w:numId="1" w16cid:durableId="1031809086">
-    <w:abstractNumId w:val="1"/>
+    <w:abstractNumId w:val="4"/>
   </w:num>
   <w:num w:numId="2" w16cid:durableId="661540993">
     <w:abstractNumId w:val="0"/>
+  </w:num>
+  <w:num w:numId="3" w16cid:durableId="510217937">
+    <w:abstractNumId w:val="3"/>
+  </w:num>
+  <w:num w:numId="4" w16cid:durableId="779226694">
+    <w:abstractNumId w:val="2"/>
+  </w:num>
+  <w:num w:numId="5" w16cid:durableId="1712195212">
+    <w:abstractNumId w:val="1"/>
   </w:num>
 </w:numbering>
 </file>

</xml_diff>